<commit_message>
Module 5.2 bioSite project submission
</commit_message>
<xml_diff>
--- a/module-4/GarciaCavazos_Mod4_2.docx
+++ b/module-4/GarciaCavazos_Mod4_2.docx
@@ -37,10 +37,23 @@
         </w:r>
       </w:hyperlink>
     </w:p>
+    <w:p>
+      <w:hyperlink r:id="rId6" w:history="1">
+        <w:r>
+          <w:rPr>
+            <w:rStyle w:val="Hyperlink"/>
+          </w:rPr>
+          <w:t>perlagc1/csd-340: Web Development Repo for CSD 340)</w:t>
+        </w:r>
+      </w:hyperlink>
+    </w:p>
     <w:p/>
     <w:p/>
     <w:p>
       <w:r>
+        <w:rPr>
+          <w:noProof/>
+        </w:rPr>
         <w:drawing>
           <wp:inline distT="0" distB="0" distL="0" distR="0" wp14:anchorId="0BC6C788" wp14:editId="2458BF40">
             <wp:extent cx="4387850" cy="2407692"/>
@@ -57,7 +70,7 @@
                     <pic:cNvPicPr/>
                   </pic:nvPicPr>
                   <pic:blipFill>
-                    <a:blip r:embed="rId6"/>
+                    <a:blip r:embed="rId7"/>
                     <a:stretch>
                       <a:fillRect/>
                     </a:stretch>
@@ -81,6 +94,9 @@
     <w:p/>
     <w:p>
       <w:r>
+        <w:rPr>
+          <w:noProof/>
+        </w:rPr>
         <w:drawing>
           <wp:inline distT="0" distB="0" distL="0" distR="0" wp14:anchorId="77BA6E33" wp14:editId="5F55665B">
             <wp:extent cx="4015516" cy="1562100"/>
@@ -97,7 +113,7 @@
                     <pic:cNvPicPr/>
                   </pic:nvPicPr>
                   <pic:blipFill>
-                    <a:blip r:embed="rId7"/>
+                    <a:blip r:embed="rId8"/>
                     <a:stretch>
                       <a:fillRect/>
                     </a:stretch>
@@ -118,6 +134,129 @@
         </w:drawing>
       </w:r>
     </w:p>
+    <w:p>
+      <w:r>
+        <w:rPr>
+          <w:noProof/>
+        </w:rPr>
+        <w:lastRenderedPageBreak/>
+        <w:drawing>
+          <wp:inline distT="0" distB="0" distL="0" distR="0" wp14:anchorId="6A77FEC1" wp14:editId="18751698">
+            <wp:extent cx="4515082" cy="1200212"/>
+            <wp:effectExtent l="0" t="0" r="0" b="0"/>
+            <wp:docPr id="1500125932" name="Picture 1"/>
+            <wp:cNvGraphicFramePr>
+              <a:graphicFrameLocks xmlns:a="http://schemas.openxmlformats.org/drawingml/2006/main" noChangeAspect="1"/>
+            </wp:cNvGraphicFramePr>
+            <a:graphic xmlns:a="http://schemas.openxmlformats.org/drawingml/2006/main">
+              <a:graphicData uri="http://schemas.openxmlformats.org/drawingml/2006/picture">
+                <pic:pic xmlns:pic="http://schemas.openxmlformats.org/drawingml/2006/picture">
+                  <pic:nvPicPr>
+                    <pic:cNvPr id="1500125932" name=""/>
+                    <pic:cNvPicPr/>
+                  </pic:nvPicPr>
+                  <pic:blipFill>
+                    <a:blip r:embed="rId9"/>
+                    <a:stretch>
+                      <a:fillRect/>
+                    </a:stretch>
+                  </pic:blipFill>
+                  <pic:spPr>
+                    <a:xfrm>
+                      <a:off x="0" y="0"/>
+                      <a:ext cx="4515082" cy="1200212"/>
+                    </a:xfrm>
+                    <a:prstGeom prst="rect">
+                      <a:avLst/>
+                    </a:prstGeom>
+                  </pic:spPr>
+                </pic:pic>
+              </a:graphicData>
+            </a:graphic>
+          </wp:inline>
+        </w:drawing>
+      </w:r>
+    </w:p>
+    <w:p>
+      <w:r>
+        <w:rPr>
+          <w:noProof/>
+        </w:rPr>
+        <w:drawing>
+          <wp:inline distT="0" distB="0" distL="0" distR="0" wp14:anchorId="2BAE61F1" wp14:editId="262AE057">
+            <wp:extent cx="3811509" cy="2930127"/>
+            <wp:effectExtent l="0" t="0" r="0" b="3810"/>
+            <wp:docPr id="1759409355" name="Picture 1"/>
+            <wp:cNvGraphicFramePr>
+              <a:graphicFrameLocks xmlns:a="http://schemas.openxmlformats.org/drawingml/2006/main" noChangeAspect="1"/>
+            </wp:cNvGraphicFramePr>
+            <a:graphic xmlns:a="http://schemas.openxmlformats.org/drawingml/2006/main">
+              <a:graphicData uri="http://schemas.openxmlformats.org/drawingml/2006/picture">
+                <pic:pic xmlns:pic="http://schemas.openxmlformats.org/drawingml/2006/picture">
+                  <pic:nvPicPr>
+                    <pic:cNvPr id="1759409355" name=""/>
+                    <pic:cNvPicPr/>
+                  </pic:nvPicPr>
+                  <pic:blipFill>
+                    <a:blip r:embed="rId10"/>
+                    <a:stretch>
+                      <a:fillRect/>
+                    </a:stretch>
+                  </pic:blipFill>
+                  <pic:spPr>
+                    <a:xfrm>
+                      <a:off x="0" y="0"/>
+                      <a:ext cx="3814621" cy="2932519"/>
+                    </a:xfrm>
+                    <a:prstGeom prst="rect">
+                      <a:avLst/>
+                    </a:prstGeom>
+                  </pic:spPr>
+                </pic:pic>
+              </a:graphicData>
+            </a:graphic>
+          </wp:inline>
+        </w:drawing>
+      </w:r>
+    </w:p>
+    <w:p/>
+    <w:p>
+      <w:pPr>
+        <w:rPr>
+          <w:rFonts w:ascii="Times New Roman" w:hAnsi="Times New Roman" w:cs="Times New Roman"/>
+          <w:sz w:val="28"/>
+          <w:szCs w:val="28"/>
+        </w:rPr>
+      </w:pPr>
+      <w:r>
+        <w:rPr>
+          <w:rFonts w:ascii="Times New Roman" w:hAnsi="Times New Roman" w:cs="Times New Roman"/>
+          <w:sz w:val="28"/>
+          <w:szCs w:val="28"/>
+        </w:rPr>
+        <w:t xml:space="preserve">Throughout Module 4.2, I learned how to combine HTML and CSS to create a visually balanced webpage that highlights both structure and design. I practiced linking external style sheets, organizing content with </w:t>
+      </w:r>
+      <w:proofErr w:type="spellStart"/>
+      <w:r>
+        <w:rPr>
+          <w:rFonts w:ascii="Times New Roman" w:hAnsi="Times New Roman" w:cs="Times New Roman"/>
+          <w:sz w:val="28"/>
+          <w:szCs w:val="28"/>
+        </w:rPr>
+        <w:t>divs</w:t>
+      </w:r>
+      <w:proofErr w:type="spellEnd"/>
+      <w:r>
+        <w:rPr>
+          <w:rFonts w:ascii="Times New Roman" w:hAnsi="Times New Roman" w:cs="Times New Roman"/>
+          <w:sz w:val="28"/>
+          <w:szCs w:val="28"/>
+        </w:rPr>
+        <w:t>, and using lists to present information clearly. This module also helped me strengthen my Git workflow by resolving conflicts, committing changes, and pushing updates to GitHub. Overall, it reminded me that patience and attention to detail are key when coding and managing projects.</w:t>
+      </w:r>
+    </w:p>
+    <w:p/>
+    <w:p/>
     <w:p/>
     <w:p/>
     <w:p/>

</xml_diff>